<commit_message>
fixes on payments sync
</commit_message>
<xml_diff>
--- a/client/public/templates/Sample_Palamboon.docx
+++ b/client/public/templates/Sample_Palamboon.docx
@@ -2157,7 +2157,23 @@
                 <w:iCs/>
                 <w:lang w:val="en-US"/>
               </w:rPr>
-              <w:t>{senderName}</w:t>
+              <w:t>{</w:t>
+            </w:r>
+            <w:r>
+              <w:rPr>
+                <w:i/>
+                <w:iCs/>
+                <w:lang w:val="en-US"/>
+              </w:rPr>
+              <w:t>n</w:t>
+            </w:r>
+            <w:r>
+              <w:rPr>
+                <w:i/>
+                <w:iCs/>
+                <w:lang w:val="en-US"/>
+              </w:rPr>
+              <w:t>ame}</w:t>
             </w:r>
           </w:p>
           <w:p>

</xml_diff>